<commit_message>
docs: add section 3.10 Produktionswerkzeuge (Pixelorama + Photoshop)
GDD section 3.10 added to TOC, markdown, and docx:
- Pixelorama (pixelorama.org): all sprites drawn manually, .pxo sources
- Adobe Photoshop: sprite assembly / spritesheets, .psd files
- Note: full per-file breakdown deferred to Medienkatalog at project end

NAMING.md: same tool note added at end of file.

Co-Authored-By: Claude Sonnet 4.6 <noreply@anthropic.com>
</commit_message>
<xml_diff>
--- a/Dokumente_Schule/Ausgefuellt/GDD_Julian_Gomez.docx
+++ b/Dokumente_Schule/Ausgefuellt/GDD_Julian_Gomez.docx
@@ -917,6 +917,33 @@
       </w:r>
     </w:p>
     <w:p>
+      <w:pPr>
+        <w:spacing w:after="60" w:line="360" w:lineRule="auto"/>
+        <w:ind w:left="360"/>
+      </w:pPr>
+      <w:r>
+        <w:rPr>
+          <w:rFonts w:ascii="Arial" w:cs="Arial" w:eastAsia="Arial" w:hAnsi="Arial"/>
+          <w:b w:val="false"/>
+          <w:bCs w:val="false"/>
+          <w:color w:val="2C4770"/>
+          <w:sz w:val="24"/>
+          <w:szCs w:val="24"/>
+        </w:rPr>
+        <w:t xml:space="preserve">3.10  </w:t>
+      </w:r>
+      <w:r>
+        <w:rPr>
+          <w:rFonts w:ascii="Arial" w:cs="Arial" w:eastAsia="Arial" w:hAnsi="Arial"/>
+          <w:b w:val="false"/>
+          <w:bCs w:val="false"/>
+          <w:sz w:val="24"/>
+          <w:szCs w:val="24"/>
+        </w:rPr>
+        <w:t xml:space="preserve">Produktionswerkzeuge (Pixel Art)</w:t>
+      </w:r>
+    </w:p>
+    <w:p>
       <w:r>
         <w:br w:type="page"/>
       </w:r>
@@ -13668,6 +13695,398 @@
         </w:tc>
       </w:tr>
     </w:tbl>
+    <w:p>
+      <w:pPr>
+        <w:spacing w:after="120" w:before="240" w:line="360" w:lineRule="auto"/>
+      </w:pPr>
+      <w:r>
+        <w:rPr>
+          <w:rFonts w:ascii="Arial" w:cs="Arial" w:eastAsia="Arial" w:hAnsi="Arial"/>
+          <w:b/>
+          <w:bCs/>
+          <w:color w:val="2C4770"/>
+          <w:sz w:val="24"/>
+          <w:szCs w:val="24"/>
+        </w:rPr>
+        <w:t xml:space="preserve">3.10  Produktionswerkzeuge (Pixel Art)</w:t>
+      </w:r>
+    </w:p>
+    <w:p>
+      <w:pPr>
+        <w:spacing w:after="100" w:line="360" w:lineRule="auto"/>
+      </w:pPr>
+      <w:r>
+        <w:rPr>
+          <w:rFonts w:ascii="Arial" w:cs="Arial" w:eastAsia="Arial" w:hAnsi="Arial"/>
+          <w:sz w:val="24"/>
+          <w:szCs w:val="24"/>
+        </w:rPr>
+        <w:t xml:space="preserve">Alle Sprites wurden manuell mit Pixelorama gezeichnet — einem Open-Source-Pixelart-Editor. Quelldateien haben die Endung .pxo. Weitere Informationen und Download: https://pixelorama.org/</w:t>
+      </w:r>
+    </w:p>
+    <w:p>
+      <w:pPr>
+        <w:spacing w:after="100" w:line="360" w:lineRule="auto"/>
+      </w:pPr>
+      <w:r>
+        <w:rPr>
+          <w:rFonts w:ascii="Arial" w:cs="Arial" w:eastAsia="Arial" w:hAnsi="Arial"/>
+          <w:sz w:val="24"/>
+          <w:szCs w:val="24"/>
+        </w:rPr>
+        <w:t xml:space="preserve">Einzelne Sprites wurden mit Adobe Photoshop zusammengesetzt, zum Beispiel beim Erstellen von Spritesheets aus Einzelteilen. Diese Dateien sind an der Endung .psd erkennbar.</w:t>
+      </w:r>
+    </w:p>
+    <w:tbl>
+      <w:tblPr>
+        <w:tblW w:type="dxa" w:w="9496"/>
+        <w:tblBorders>
+          <w:top w:val="single" w:color="auto" w:sz="4"/>
+          <w:left w:val="single" w:color="auto" w:sz="4"/>
+          <w:bottom w:val="single" w:color="auto" w:sz="4"/>
+          <w:right w:val="single" w:color="auto" w:sz="4"/>
+          <w:insideH w:val="single" w:color="auto" w:sz="4"/>
+          <w:insideV w:val="single" w:color="auto" w:sz="4"/>
+        </w:tblBorders>
+      </w:tblPr>
+      <w:tblGrid>
+        <w:gridCol w:w="2393"/>
+        <w:gridCol w:w="5189"/>
+        <w:gridCol w:w="1914"/>
+      </w:tblGrid>
+      <w:tr>
+        <w:tc>
+          <w:tcPr>
+            <w:tcW w:type="dxa" w:w="2393"/>
+            <w:tcBorders>
+              <w:top w:val="single" w:color="BBBBBB" w:sz="4"/>
+              <w:left w:val="single" w:color="BBBBBB" w:sz="4"/>
+              <w:bottom w:val="single" w:color="BBBBBB" w:sz="4"/>
+              <w:right w:val="single" w:color="BBBBBB" w:sz="4"/>
+            </w:tcBorders>
+            <w:shd w:fill="2C4770" w:val="clear"/>
+            <w:tcMar>
+              <w:top w:type="dxa" w:w="80"/>
+              <w:left w:type="dxa" w:w="100"/>
+              <w:bottom w:type="dxa" w:w="80"/>
+              <w:right w:type="dxa" w:w="100"/>
+            </w:tcMar>
+            <w:vAlign w:val="center"/>
+          </w:tcPr>
+          <w:p>
+            <w:pPr>
+              <w:spacing w:line="240" w:lineRule="auto"/>
+              <w:jc w:val="center"/>
+            </w:pPr>
+            <w:r>
+              <w:rPr>
+                <w:rFonts w:ascii="Arial" w:cs="Arial" w:eastAsia="Arial" w:hAnsi="Arial"/>
+                <w:b/>
+                <w:bCs/>
+                <w:color w:val="FFFFFF"/>
+                <w:sz w:val="20"/>
+                <w:szCs w:val="20"/>
+              </w:rPr>
+              <w:t xml:space="preserve">Software</w:t>
+            </w:r>
+          </w:p>
+        </w:tc>
+        <w:tc>
+          <w:tcPr>
+            <w:tcW w:type="dxa" w:w="5189"/>
+            <w:tcBorders>
+              <w:top w:val="single" w:color="BBBBBB" w:sz="4"/>
+              <w:left w:val="single" w:color="BBBBBB" w:sz="4"/>
+              <w:bottom w:val="single" w:color="BBBBBB" w:sz="4"/>
+              <w:right w:val="single" w:color="BBBBBB" w:sz="4"/>
+            </w:tcBorders>
+            <w:shd w:fill="2C4770" w:val="clear"/>
+            <w:tcMar>
+              <w:top w:type="dxa" w:w="80"/>
+              <w:left w:type="dxa" w:w="100"/>
+              <w:bottom w:type="dxa" w:w="80"/>
+              <w:right w:type="dxa" w:w="100"/>
+            </w:tcMar>
+            <w:vAlign w:val="center"/>
+          </w:tcPr>
+          <w:p>
+            <w:pPr>
+              <w:spacing w:line="240" w:lineRule="auto"/>
+              <w:jc w:val="center"/>
+            </w:pPr>
+            <w:r>
+              <w:rPr>
+                <w:rFonts w:ascii="Arial" w:cs="Arial" w:eastAsia="Arial" w:hAnsi="Arial"/>
+                <w:b/>
+                <w:bCs/>
+                <w:color w:val="FFFFFF"/>
+                <w:sz w:val="20"/>
+                <w:szCs w:val="20"/>
+              </w:rPr>
+              <w:t xml:space="preserve">Verwendung</w:t>
+            </w:r>
+          </w:p>
+        </w:tc>
+        <w:tc>
+          <w:tcPr>
+            <w:tcW w:type="dxa" w:w="1914"/>
+            <w:tcBorders>
+              <w:top w:val="single" w:color="BBBBBB" w:sz="4"/>
+              <w:left w:val="single" w:color="BBBBBB" w:sz="4"/>
+              <w:bottom w:val="single" w:color="BBBBBB" w:sz="4"/>
+              <w:right w:val="single" w:color="BBBBBB" w:sz="4"/>
+            </w:tcBorders>
+            <w:shd w:fill="2C4770" w:val="clear"/>
+            <w:tcMar>
+              <w:top w:type="dxa" w:w="80"/>
+              <w:left w:type="dxa" w:w="100"/>
+              <w:bottom w:type="dxa" w:w="80"/>
+              <w:right w:type="dxa" w:w="100"/>
+            </w:tcMar>
+            <w:vAlign w:val="center"/>
+          </w:tcPr>
+          <w:p>
+            <w:pPr>
+              <w:spacing w:line="240" w:lineRule="auto"/>
+              <w:jc w:val="center"/>
+            </w:pPr>
+            <w:r>
+              <w:rPr>
+                <w:rFonts w:ascii="Arial" w:cs="Arial" w:eastAsia="Arial" w:hAnsi="Arial"/>
+                <w:b/>
+                <w:bCs/>
+                <w:color w:val="FFFFFF"/>
+                <w:sz w:val="20"/>
+                <w:szCs w:val="20"/>
+              </w:rPr>
+              <w:t xml:space="preserve">Erkennbar an</w:t>
+            </w:r>
+          </w:p>
+        </w:tc>
+      </w:tr>
+      <w:tr>
+        <w:tc>
+          <w:tcPr>
+            <w:tcW w:type="dxa" w:w="2393"/>
+            <w:tcBorders>
+              <w:top w:val="single" w:color="BBBBBB" w:sz="4"/>
+              <w:left w:val="single" w:color="BBBBBB" w:sz="4"/>
+              <w:bottom w:val="single" w:color="BBBBBB" w:sz="4"/>
+              <w:right w:val="single" w:color="BBBBBB" w:sz="4"/>
+            </w:tcBorders>
+            <w:tcMar>
+              <w:top w:type="dxa" w:w="60"/>
+              <w:left w:type="dxa" w:w="100"/>
+              <w:bottom w:type="dxa" w:w="60"/>
+              <w:right w:type="dxa" w:w="100"/>
+            </w:tcMar>
+            <w:vAlign w:val="center"/>
+          </w:tcPr>
+          <w:p>
+            <w:pPr>
+              <w:spacing w:line="240" w:lineRule="auto"/>
+              <w:jc w:val="left"/>
+            </w:pPr>
+            <w:r>
+              <w:rPr>
+                <w:rFonts w:ascii="Arial" w:cs="Arial" w:eastAsia="Arial" w:hAnsi="Arial"/>
+                <w:b w:val="false"/>
+                <w:bCs w:val="false"/>
+                <w:sz w:val="18"/>
+                <w:szCs w:val="18"/>
+              </w:rPr>
+              <w:t xml:space="preserve">Pixelorama</w:t>
+            </w:r>
+          </w:p>
+        </w:tc>
+        <w:tc>
+          <w:tcPr>
+            <w:tcW w:type="dxa" w:w="5189"/>
+            <w:tcBorders>
+              <w:top w:val="single" w:color="BBBBBB" w:sz="4"/>
+              <w:left w:val="single" w:color="BBBBBB" w:sz="4"/>
+              <w:bottom w:val="single" w:color="BBBBBB" w:sz="4"/>
+              <w:right w:val="single" w:color="BBBBBB" w:sz="4"/>
+            </w:tcBorders>
+            <w:tcMar>
+              <w:top w:type="dxa" w:w="60"/>
+              <w:left w:type="dxa" w:w="100"/>
+              <w:bottom w:type="dxa" w:w="60"/>
+              <w:right w:type="dxa" w:w="100"/>
+            </w:tcMar>
+            <w:vAlign w:val="center"/>
+          </w:tcPr>
+          <w:p>
+            <w:pPr>
+              <w:spacing w:line="240" w:lineRule="auto"/>
+              <w:jc w:val="left"/>
+            </w:pPr>
+            <w:r>
+              <w:rPr>
+                <w:rFonts w:ascii="Arial" w:cs="Arial" w:eastAsia="Arial" w:hAnsi="Arial"/>
+                <w:b w:val="false"/>
+                <w:bCs w:val="false"/>
+                <w:sz w:val="18"/>
+                <w:szCs w:val="18"/>
+              </w:rPr>
+              <w:t xml:space="preserve">Erstellung aller Pixel-Art-Sprites (manuell gezeichnet)</w:t>
+            </w:r>
+          </w:p>
+        </w:tc>
+        <w:tc>
+          <w:tcPr>
+            <w:tcW w:type="dxa" w:w="1914"/>
+            <w:tcBorders>
+              <w:top w:val="single" w:color="BBBBBB" w:sz="4"/>
+              <w:left w:val="single" w:color="BBBBBB" w:sz="4"/>
+              <w:bottom w:val="single" w:color="BBBBBB" w:sz="4"/>
+              <w:right w:val="single" w:color="BBBBBB" w:sz="4"/>
+            </w:tcBorders>
+            <w:tcMar>
+              <w:top w:type="dxa" w:w="60"/>
+              <w:left w:type="dxa" w:w="100"/>
+              <w:bottom w:type="dxa" w:w="60"/>
+              <w:right w:type="dxa" w:w="100"/>
+            </w:tcMar>
+            <w:vAlign w:val="center"/>
+          </w:tcPr>
+          <w:p>
+            <w:pPr>
+              <w:spacing w:line="240" w:lineRule="auto"/>
+              <w:jc w:val="left"/>
+            </w:pPr>
+            <w:r>
+              <w:rPr>
+                <w:rFonts w:ascii="Arial" w:cs="Arial" w:eastAsia="Arial" w:hAnsi="Arial"/>
+                <w:b w:val="false"/>
+                <w:bCs w:val="false"/>
+                <w:sz w:val="18"/>
+                <w:szCs w:val="18"/>
+              </w:rPr>
+              <w:t xml:space="preserve">.pxo Quelldatei</w:t>
+            </w:r>
+          </w:p>
+        </w:tc>
+      </w:tr>
+      <w:tr>
+        <w:tc>
+          <w:tcPr>
+            <w:tcW w:type="dxa" w:w="2393"/>
+            <w:tcBorders>
+              <w:top w:val="single" w:color="BBBBBB" w:sz="4"/>
+              <w:left w:val="single" w:color="BBBBBB" w:sz="4"/>
+              <w:bottom w:val="single" w:color="BBBBBB" w:sz="4"/>
+              <w:right w:val="single" w:color="BBBBBB" w:sz="4"/>
+            </w:tcBorders>
+            <w:tcMar>
+              <w:top w:type="dxa" w:w="60"/>
+              <w:left w:type="dxa" w:w="100"/>
+              <w:bottom w:type="dxa" w:w="60"/>
+              <w:right w:type="dxa" w:w="100"/>
+            </w:tcMar>
+            <w:vAlign w:val="center"/>
+          </w:tcPr>
+          <w:p>
+            <w:pPr>
+              <w:spacing w:line="240" w:lineRule="auto"/>
+              <w:jc w:val="left"/>
+            </w:pPr>
+            <w:r>
+              <w:rPr>
+                <w:rFonts w:ascii="Arial" w:cs="Arial" w:eastAsia="Arial" w:hAnsi="Arial"/>
+                <w:b w:val="false"/>
+                <w:bCs w:val="false"/>
+                <w:sz w:val="18"/>
+                <w:szCs w:val="18"/>
+              </w:rPr>
+              <w:t xml:space="preserve">Adobe Photoshop</w:t>
+            </w:r>
+          </w:p>
+        </w:tc>
+        <w:tc>
+          <w:tcPr>
+            <w:tcW w:type="dxa" w:w="5189"/>
+            <w:tcBorders>
+              <w:top w:val="single" w:color="BBBBBB" w:sz="4"/>
+              <w:left w:val="single" w:color="BBBBBB" w:sz="4"/>
+              <w:bottom w:val="single" w:color="BBBBBB" w:sz="4"/>
+              <w:right w:val="single" w:color="BBBBBB" w:sz="4"/>
+            </w:tcBorders>
+            <w:tcMar>
+              <w:top w:type="dxa" w:w="60"/>
+              <w:left w:type="dxa" w:w="100"/>
+              <w:bottom w:type="dxa" w:w="60"/>
+              <w:right w:type="dxa" w:w="100"/>
+            </w:tcMar>
+            <w:vAlign w:val="center"/>
+          </w:tcPr>
+          <w:p>
+            <w:pPr>
+              <w:spacing w:line="240" w:lineRule="auto"/>
+              <w:jc w:val="left"/>
+            </w:pPr>
+            <w:r>
+              <w:rPr>
+                <w:rFonts w:ascii="Arial" w:cs="Arial" w:eastAsia="Arial" w:hAnsi="Arial"/>
+                <w:b w:val="false"/>
+                <w:bCs w:val="false"/>
+                <w:sz w:val="18"/>
+                <w:szCs w:val="18"/>
+              </w:rPr>
+              <w:t xml:space="preserve">Zusammensetzen von Sprites / Spritesheets</w:t>
+            </w:r>
+          </w:p>
+        </w:tc>
+        <w:tc>
+          <w:tcPr>
+            <w:tcW w:type="dxa" w:w="1914"/>
+            <w:tcBorders>
+              <w:top w:val="single" w:color="BBBBBB" w:sz="4"/>
+              <w:left w:val="single" w:color="BBBBBB" w:sz="4"/>
+              <w:bottom w:val="single" w:color="BBBBBB" w:sz="4"/>
+              <w:right w:val="single" w:color="BBBBBB" w:sz="4"/>
+            </w:tcBorders>
+            <w:tcMar>
+              <w:top w:type="dxa" w:w="60"/>
+              <w:left w:type="dxa" w:w="100"/>
+              <w:bottom w:type="dxa" w:w="60"/>
+              <w:right w:type="dxa" w:w="100"/>
+            </w:tcMar>
+            <w:vAlign w:val="center"/>
+          </w:tcPr>
+          <w:p>
+            <w:pPr>
+              <w:spacing w:line="240" w:lineRule="auto"/>
+              <w:jc w:val="left"/>
+            </w:pPr>
+            <w:r>
+              <w:rPr>
+                <w:rFonts w:ascii="Arial" w:cs="Arial" w:eastAsia="Arial" w:hAnsi="Arial"/>
+                <w:b w:val="false"/>
+                <w:bCs w:val="false"/>
+                <w:sz w:val="18"/>
+                <w:szCs w:val="18"/>
+              </w:rPr>
+              <w:t xml:space="preserve">.psd Datei</w:t>
+            </w:r>
+          </w:p>
+        </w:tc>
+      </w:tr>
+    </w:tbl>
+    <w:p>
+      <w:pPr>
+        <w:spacing w:before="160" w:line="360" w:lineRule="auto"/>
+      </w:pPr>
+      <w:r>
+        <w:rPr>
+          <w:rFonts w:ascii="Arial" w:cs="Arial" w:eastAsia="Arial" w:hAnsi="Arial"/>
+          <w:color w:val="666666"/>
+          <w:sz w:val="18"/>
+          <w:szCs w:val="18"/>
+        </w:rPr>
+        <w:t xml:space="preserve">Vollständige Liste welche Datei mit welchem Tool erstellt wurde folgt im Medienkatalog am Projektende.</w:t>
+      </w:r>
+    </w:p>
     <w:sectPr>
       <w:headerReference w:type="default" r:id="rId7"/>
       <w:footerReference w:type="default" r:id="rId8"/>

</xml_diff>